<commit_message>
docs: finalize design system with colors, typography, and spacing
</commit_message>
<xml_diff>
--- a/Design System Fonoflow.DOCX
+++ b/Design System Fonoflow.DOCX
@@ -367,13 +367,8 @@
           </w:tcPr>
           <w:p>
             <w:r>
-              <w:t>Iniciar/crear/cuenta/</w:t>
-            </w:r>
-            <w:proofErr w:type="spellStart"/>
-            <w:r>
-              <w:t>etc</w:t>
-            </w:r>
-            <w:proofErr w:type="spellEnd"/>
+              <w:t>Título</w:t>
+            </w:r>
           </w:p>
         </w:tc>
         <w:tc>
@@ -398,7 +393,7 @@
               <w:cnfStyle w:val="000000000000" w:firstRow="0" w:lastRow="0" w:firstColumn="0" w:lastColumn="0" w:oddVBand="0" w:evenVBand="0" w:oddHBand="0" w:evenHBand="0" w:firstRowFirstColumn="0" w:firstRowLastColumn="0" w:lastRowFirstColumn="0" w:lastRowLastColumn="0"/>
             </w:pPr>
             <w:r>
-              <w:t>40</w:t>
+              <w:t>48px</w:t>
             </w:r>
           </w:p>
         </w:tc>
@@ -410,9 +405,11 @@
             <w:pPr>
               <w:cnfStyle w:val="000000000000" w:firstRow="0" w:lastRow="0" w:firstColumn="0" w:lastColumn="0" w:oddVBand="0" w:evenVBand="0" w:oddHBand="0" w:evenHBand="0" w:firstRowFirstColumn="0" w:firstRowLastColumn="0" w:lastRowFirstColumn="0" w:lastRowLastColumn="0"/>
             </w:pPr>
-            <w:r>
-              <w:t>Regular</w:t>
-            </w:r>
+            <w:proofErr w:type="spellStart"/>
+            <w:r>
+              <w:t>Sembold</w:t>
+            </w:r>
+            <w:proofErr w:type="spellEnd"/>
           </w:p>
         </w:tc>
       </w:tr>
@@ -427,11 +424,13 @@
           </w:tcPr>
           <w:p>
             <w:r>
-              <w:t xml:space="preserve">Título de </w:t>
-            </w:r>
-            <w:r>
-              <w:t>Resultado de palabras</w:t>
-            </w:r>
+              <w:t>Iniciar/crear/cuenta/</w:t>
+            </w:r>
+            <w:proofErr w:type="spellStart"/>
+            <w:r>
+              <w:t>etc</w:t>
+            </w:r>
+            <w:proofErr w:type="spellEnd"/>
           </w:p>
         </w:tc>
         <w:tc>
@@ -456,7 +455,7 @@
               <w:cnfStyle w:val="000000100000" w:firstRow="0" w:lastRow="0" w:firstColumn="0" w:lastColumn="0" w:oddVBand="0" w:evenVBand="0" w:oddHBand="1" w:evenHBand="0" w:firstRowFirstColumn="0" w:firstRowLastColumn="0" w:lastRowFirstColumn="0" w:lastRowLastColumn="0"/>
             </w:pPr>
             <w:r>
-              <w:t>35</w:t>
+              <w:t>28</w:t>
             </w:r>
           </w:p>
         </w:tc>
@@ -469,13 +468,8 @@
               <w:cnfStyle w:val="000000100000" w:firstRow="0" w:lastRow="0" w:firstColumn="0" w:lastColumn="0" w:oddVBand="0" w:evenVBand="0" w:oddHBand="1" w:evenHBand="0" w:firstRowFirstColumn="0" w:firstRowLastColumn="0" w:lastRowFirstColumn="0" w:lastRowLastColumn="0"/>
             </w:pPr>
             <w:r>
-              <w:t xml:space="preserve">Semi </w:t>
-            </w:r>
-            <w:proofErr w:type="spellStart"/>
-            <w:r>
-              <w:t>bold</w:t>
-            </w:r>
-            <w:proofErr w:type="spellEnd"/>
+              <w:t>Regular</w:t>
+            </w:r>
           </w:p>
         </w:tc>
       </w:tr>
@@ -487,7 +481,10 @@
           </w:tcPr>
           <w:p>
             <w:r>
-              <w:t>Textos secundarios</w:t>
+              <w:t xml:space="preserve">Título de </w:t>
+            </w:r>
+            <w:r>
+              <w:t>Resultado de palabras</w:t>
             </w:r>
           </w:p>
         </w:tc>
@@ -513,7 +510,7 @@
               <w:cnfStyle w:val="000000000000" w:firstRow="0" w:lastRow="0" w:firstColumn="0" w:lastColumn="0" w:oddVBand="0" w:evenVBand="0" w:oddHBand="0" w:evenHBand="0" w:firstRowFirstColumn="0" w:firstRowLastColumn="0" w:lastRowFirstColumn="0" w:lastRowLastColumn="0"/>
             </w:pPr>
             <w:r>
-              <w:t>40</w:t>
+              <w:t>35</w:t>
             </w:r>
           </w:p>
         </w:tc>
@@ -526,8 +523,13 @@
               <w:cnfStyle w:val="000000000000" w:firstRow="0" w:lastRow="0" w:firstColumn="0" w:lastColumn="0" w:oddVBand="0" w:evenVBand="0" w:oddHBand="0" w:evenHBand="0" w:firstRowFirstColumn="0" w:firstRowLastColumn="0" w:lastRowFirstColumn="0" w:lastRowLastColumn="0"/>
             </w:pPr>
             <w:r>
-              <w:t>Regular</w:t>
-            </w:r>
+              <w:t xml:space="preserve">Semi </w:t>
+            </w:r>
+            <w:proofErr w:type="spellStart"/>
+            <w:r>
+              <w:t>bold</w:t>
+            </w:r>
+            <w:proofErr w:type="spellEnd"/>
           </w:p>
         </w:tc>
       </w:tr>
@@ -542,7 +544,7 @@
           </w:tcPr>
           <w:p>
             <w:r>
-              <w:t>Palabras de resultados</w:t>
+              <w:t>Textos secundarios</w:t>
             </w:r>
           </w:p>
         </w:tc>
@@ -593,11 +595,9 @@
             <w:tcW w:w="2824" w:type="dxa"/>
           </w:tcPr>
           <w:p>
-            <w:proofErr w:type="spellStart"/>
-            <w:r>
-              <w:t>Footpage</w:t>
-            </w:r>
-            <w:proofErr w:type="spellEnd"/>
+            <w:r>
+              <w:t>Palabras de resultados</w:t>
+            </w:r>
           </w:p>
         </w:tc>
         <w:tc>
@@ -640,6 +640,63 @@
           </w:p>
         </w:tc>
       </w:tr>
+      <w:tr>
+        <w:trPr>
+          <w:cnfStyle w:val="000000100000" w:firstRow="0" w:lastRow="0" w:firstColumn="0" w:lastColumn="0" w:oddVBand="0" w:evenVBand="0" w:oddHBand="1" w:evenHBand="0" w:firstRowFirstColumn="0" w:firstRowLastColumn="0" w:lastRowFirstColumn="0" w:lastRowLastColumn="0"/>
+        </w:trPr>
+        <w:tc>
+          <w:tcPr>
+            <w:cnfStyle w:val="001000000000" w:firstRow="0" w:lastRow="0" w:firstColumn="1" w:lastColumn="0" w:oddVBand="0" w:evenVBand="0" w:oddHBand="0" w:evenHBand="0" w:firstRowFirstColumn="0" w:firstRowLastColumn="0" w:lastRowFirstColumn="0" w:lastRowLastColumn="0"/>
+            <w:tcW w:w="2824" w:type="dxa"/>
+          </w:tcPr>
+          <w:p>
+            <w:proofErr w:type="spellStart"/>
+            <w:r>
+              <w:t>Footpage</w:t>
+            </w:r>
+            <w:proofErr w:type="spellEnd"/>
+          </w:p>
+        </w:tc>
+        <w:tc>
+          <w:tcPr>
+            <w:tcW w:w="1997" w:type="dxa"/>
+          </w:tcPr>
+          <w:p>
+            <w:pPr>
+              <w:cnfStyle w:val="000000100000" w:firstRow="0" w:lastRow="0" w:firstColumn="0" w:lastColumn="0" w:oddVBand="0" w:evenVBand="0" w:oddHBand="1" w:evenHBand="0" w:firstRowFirstColumn="0" w:firstRowLastColumn="0" w:lastRowFirstColumn="0" w:lastRowLastColumn="0"/>
+            </w:pPr>
+            <w:r>
+              <w:t>Inter</w:t>
+            </w:r>
+          </w:p>
+        </w:tc>
+        <w:tc>
+          <w:tcPr>
+            <w:tcW w:w="2014" w:type="dxa"/>
+          </w:tcPr>
+          <w:p>
+            <w:pPr>
+              <w:cnfStyle w:val="000000100000" w:firstRow="0" w:lastRow="0" w:firstColumn="0" w:lastColumn="0" w:oddVBand="0" w:evenVBand="0" w:oddHBand="1" w:evenHBand="0" w:firstRowFirstColumn="0" w:firstRowLastColumn="0" w:lastRowFirstColumn="0" w:lastRowLastColumn="0"/>
+            </w:pPr>
+            <w:r>
+              <w:t>30</w:t>
+            </w:r>
+          </w:p>
+        </w:tc>
+        <w:tc>
+          <w:tcPr>
+            <w:tcW w:w="2003" w:type="dxa"/>
+          </w:tcPr>
+          <w:p>
+            <w:pPr>
+              <w:cnfStyle w:val="000000100000" w:firstRow="0" w:lastRow="0" w:firstColumn="0" w:lastColumn="0" w:oddVBand="0" w:evenVBand="0" w:oddHBand="1" w:evenHBand="0" w:firstRowFirstColumn="0" w:firstRowLastColumn="0" w:lastRowFirstColumn="0" w:lastRowLastColumn="0"/>
+            </w:pPr>
+            <w:r>
+              <w:t>Regular</w:t>
+            </w:r>
+          </w:p>
+        </w:tc>
+      </w:tr>
     </w:tbl>
     <w:p/>
     <w:p>
@@ -651,6 +708,2189 @@
       </w:r>
       <w:r>
         <w:t>s</w:t>
+      </w:r>
+    </w:p>
+    <w:p>
+      <w:r>
+        <w:t xml:space="preserve">Sí. De hecho, si quieres que tu </w:t>
+      </w:r>
+      <w:proofErr w:type="spellStart"/>
+      <w:r>
+        <w:rPr>
+          <w:b/>
+          <w:bCs/>
+        </w:rPr>
+        <w:t>Design</w:t>
+      </w:r>
+      <w:proofErr w:type="spellEnd"/>
+      <w:r>
+        <w:rPr>
+          <w:b/>
+          <w:bCs/>
+        </w:rPr>
+        <w:t xml:space="preserve"> </w:t>
+      </w:r>
+      <w:proofErr w:type="spellStart"/>
+      <w:r>
+        <w:rPr>
+          <w:b/>
+          <w:bCs/>
+        </w:rPr>
+        <w:t>System</w:t>
+      </w:r>
+      <w:proofErr w:type="spellEnd"/>
+      <w:r>
+        <w:t xml:space="preserve"> se vea profesional (como los de Google Material </w:t>
+      </w:r>
+      <w:proofErr w:type="spellStart"/>
+      <w:r>
+        <w:t>Design</w:t>
+      </w:r>
+      <w:proofErr w:type="spellEnd"/>
+      <w:r>
+        <w:t xml:space="preserve"> o IBM Carbon), es mejor que las reglas sean </w:t>
+      </w:r>
+      <w:r>
+        <w:rPr>
+          <w:b/>
+          <w:bCs/>
+        </w:rPr>
+        <w:t>genéricas y reutilizables</w:t>
+      </w:r>
+      <w:r>
+        <w:t>, no específicas de una sola pantalla.</w:t>
+      </w:r>
+    </w:p>
+    <w:p>
+      <w:r>
+        <w:t>Yo la organizaría por categorías.</w:t>
+      </w:r>
+    </w:p>
+    <w:p>
+      <w:r>
+        <w:pict w14:anchorId="54A5CB9D">
+          <v:rect id="_x0000_i1025" style="width:0;height:1.5pt" o:hralign="center" o:hrstd="t" o:hr="t" fillcolor="#a0a0a0" stroked="f"/>
+        </w:pict>
+      </w:r>
+    </w:p>
+    <w:p>
+      <w:pPr>
+        <w:rPr>
+          <w:b/>
+          <w:bCs/>
+        </w:rPr>
+      </w:pPr>
+      <w:r>
+        <w:rPr>
+          <w:rFonts w:ascii="Segoe UI Emoji" w:hAnsi="Segoe UI Emoji" w:cs="Segoe UI Emoji"/>
+          <w:b/>
+          <w:bCs/>
+        </w:rPr>
+        <w:t>📏</w:t>
+      </w:r>
+      <w:r>
+        <w:rPr>
+          <w:b/>
+          <w:bCs/>
+        </w:rPr>
+        <w:t xml:space="preserve"> Espaciados</w:t>
+      </w:r>
+    </w:p>
+    <w:p>
+      <w:pPr>
+        <w:rPr>
+          <w:b/>
+          <w:bCs/>
+        </w:rPr>
+      </w:pPr>
+      <w:r>
+        <w:rPr>
+          <w:b/>
+          <w:bCs/>
+        </w:rPr>
+        <w:t>1. Márgenes de la página</w:t>
+      </w:r>
+    </w:p>
+    <w:tbl>
+      <w:tblPr>
+        <w:tblW w:w="0" w:type="auto"/>
+        <w:tblCellSpacing w:w="15" w:type="dxa"/>
+        <w:tblCellMar>
+          <w:top w:w="15" w:type="dxa"/>
+          <w:left w:w="15" w:type="dxa"/>
+          <w:bottom w:w="15" w:type="dxa"/>
+          <w:right w:w="15" w:type="dxa"/>
+        </w:tblCellMar>
+        <w:tblLook w:val="04A0" w:firstRow="1" w:lastRow="0" w:firstColumn="1" w:lastColumn="0" w:noHBand="0" w:noVBand="1"/>
+      </w:tblPr>
+      <w:tblGrid>
+        <w:gridCol w:w="2716"/>
+        <w:gridCol w:w="625"/>
+        <w:gridCol w:w="5497"/>
+      </w:tblGrid>
+      <w:tr>
+        <w:trPr>
+          <w:tblHeader/>
+          <w:tblCellSpacing w:w="15" w:type="dxa"/>
+        </w:trPr>
+        <w:tc>
+          <w:tcPr>
+            <w:tcW w:w="0" w:type="auto"/>
+            <w:vAlign w:val="center"/>
+            <w:hideMark/>
+          </w:tcPr>
+          <w:p>
+            <w:pPr>
+              <w:rPr>
+                <w:b/>
+                <w:bCs/>
+              </w:rPr>
+            </w:pPr>
+            <w:r>
+              <w:rPr>
+                <w:b/>
+                <w:bCs/>
+              </w:rPr>
+              <w:t>Elemento</w:t>
+            </w:r>
+          </w:p>
+        </w:tc>
+        <w:tc>
+          <w:tcPr>
+            <w:tcW w:w="0" w:type="auto"/>
+            <w:vAlign w:val="center"/>
+            <w:hideMark/>
+          </w:tcPr>
+          <w:p>
+            <w:pPr>
+              <w:rPr>
+                <w:b/>
+                <w:bCs/>
+              </w:rPr>
+            </w:pPr>
+            <w:r>
+              <w:rPr>
+                <w:b/>
+                <w:bCs/>
+              </w:rPr>
+              <w:t>Valor</w:t>
+            </w:r>
+          </w:p>
+        </w:tc>
+        <w:tc>
+          <w:tcPr>
+            <w:tcW w:w="0" w:type="auto"/>
+            <w:vAlign w:val="center"/>
+            <w:hideMark/>
+          </w:tcPr>
+          <w:p>
+            <w:pPr>
+              <w:rPr>
+                <w:b/>
+                <w:bCs/>
+              </w:rPr>
+            </w:pPr>
+            <w:r>
+              <w:rPr>
+                <w:b/>
+                <w:bCs/>
+              </w:rPr>
+              <w:t>Uso</w:t>
+            </w:r>
+          </w:p>
+        </w:tc>
+      </w:tr>
+      <w:tr>
+        <w:trPr>
+          <w:tblCellSpacing w:w="15" w:type="dxa"/>
+        </w:trPr>
+        <w:tc>
+          <w:tcPr>
+            <w:tcW w:w="0" w:type="auto"/>
+            <w:vAlign w:val="center"/>
+            <w:hideMark/>
+          </w:tcPr>
+          <w:p>
+            <w:r>
+              <w:t>Margen superior de la página</w:t>
+            </w:r>
+          </w:p>
+        </w:tc>
+        <w:tc>
+          <w:tcPr>
+            <w:tcW w:w="0" w:type="auto"/>
+            <w:vAlign w:val="center"/>
+            <w:hideMark/>
+          </w:tcPr>
+          <w:p>
+            <w:r>
+              <w:t>0px</w:t>
+            </w:r>
+          </w:p>
+        </w:tc>
+        <w:tc>
+          <w:tcPr>
+            <w:tcW w:w="0" w:type="auto"/>
+            <w:vAlign w:val="center"/>
+            <w:hideMark/>
+          </w:tcPr>
+          <w:p>
+            <w:r>
+              <w:t>Separación entre el borde superior de la ventana y el contenido.</w:t>
+            </w:r>
+          </w:p>
+        </w:tc>
+      </w:tr>
+      <w:tr>
+        <w:trPr>
+          <w:tblCellSpacing w:w="15" w:type="dxa"/>
+        </w:trPr>
+        <w:tc>
+          <w:tcPr>
+            <w:tcW w:w="0" w:type="auto"/>
+            <w:vAlign w:val="center"/>
+            <w:hideMark/>
+          </w:tcPr>
+          <w:p>
+            <w:r>
+              <w:t>Margen inferior de la página</w:t>
+            </w:r>
+          </w:p>
+        </w:tc>
+        <w:tc>
+          <w:tcPr>
+            <w:tcW w:w="0" w:type="auto"/>
+            <w:vAlign w:val="center"/>
+            <w:hideMark/>
+          </w:tcPr>
+          <w:p>
+            <w:r>
+              <w:t>0px</w:t>
+            </w:r>
+          </w:p>
+        </w:tc>
+        <w:tc>
+          <w:tcPr>
+            <w:tcW w:w="0" w:type="auto"/>
+            <w:vAlign w:val="center"/>
+            <w:hideMark/>
+          </w:tcPr>
+          <w:p>
+            <w:r>
+              <w:t xml:space="preserve">Separación entre el contenido y el </w:t>
+            </w:r>
+            <w:proofErr w:type="spellStart"/>
+            <w:r>
+              <w:t>footer</w:t>
+            </w:r>
+            <w:proofErr w:type="spellEnd"/>
+            <w:r>
+              <w:t>.</w:t>
+            </w:r>
+          </w:p>
+        </w:tc>
+      </w:tr>
+      <w:tr>
+        <w:trPr>
+          <w:tblCellSpacing w:w="15" w:type="dxa"/>
+        </w:trPr>
+        <w:tc>
+          <w:tcPr>
+            <w:tcW w:w="0" w:type="auto"/>
+            <w:vAlign w:val="center"/>
+            <w:hideMark/>
+          </w:tcPr>
+          <w:p>
+            <w:r>
+              <w:t>Margen izquierdo de la página</w:t>
+            </w:r>
+          </w:p>
+        </w:tc>
+        <w:tc>
+          <w:tcPr>
+            <w:tcW w:w="0" w:type="auto"/>
+            <w:vAlign w:val="center"/>
+            <w:hideMark/>
+          </w:tcPr>
+          <w:p>
+            <w:r>
+              <w:t>0px</w:t>
+            </w:r>
+          </w:p>
+        </w:tc>
+        <w:tc>
+          <w:tcPr>
+            <w:tcW w:w="0" w:type="auto"/>
+            <w:vAlign w:val="center"/>
+            <w:hideMark/>
+          </w:tcPr>
+          <w:p>
+            <w:r>
+              <w:t>Margen lateral izquierdo.</w:t>
+            </w:r>
+          </w:p>
+        </w:tc>
+      </w:tr>
+      <w:tr>
+        <w:trPr>
+          <w:tblCellSpacing w:w="15" w:type="dxa"/>
+        </w:trPr>
+        <w:tc>
+          <w:tcPr>
+            <w:tcW w:w="0" w:type="auto"/>
+            <w:vAlign w:val="center"/>
+            <w:hideMark/>
+          </w:tcPr>
+          <w:p>
+            <w:r>
+              <w:t>Margen derecho de la página</w:t>
+            </w:r>
+          </w:p>
+        </w:tc>
+        <w:tc>
+          <w:tcPr>
+            <w:tcW w:w="0" w:type="auto"/>
+            <w:vAlign w:val="center"/>
+            <w:hideMark/>
+          </w:tcPr>
+          <w:p>
+            <w:r>
+              <w:t>0px</w:t>
+            </w:r>
+          </w:p>
+        </w:tc>
+        <w:tc>
+          <w:tcPr>
+            <w:tcW w:w="0" w:type="auto"/>
+            <w:vAlign w:val="center"/>
+            <w:hideMark/>
+          </w:tcPr>
+          <w:p>
+            <w:r>
+              <w:t>Margen lateral derecho.</w:t>
+            </w:r>
+          </w:p>
+        </w:tc>
+      </w:tr>
+    </w:tbl>
+    <w:p>
+      <w:r>
+        <w:pict w14:anchorId="7781215F">
+          <v:rect id="_x0000_i1026" style="width:0;height:1.5pt" o:hralign="center" o:hrstd="t" o:hr="t" fillcolor="#a0a0a0" stroked="f"/>
+        </w:pict>
+      </w:r>
+    </w:p>
+    <w:p/>
+    <w:p>
+      <w:pPr>
+        <w:rPr>
+          <w:b/>
+          <w:bCs/>
+        </w:rPr>
+      </w:pPr>
+      <w:r>
+        <w:rPr>
+          <w:b/>
+          <w:bCs/>
+        </w:rPr>
+        <w:lastRenderedPageBreak/>
+        <w:t>2. Header y Footer</w:t>
+      </w:r>
+    </w:p>
+    <w:tbl>
+      <w:tblPr>
+        <w:tblW w:w="0" w:type="auto"/>
+        <w:tblCellSpacing w:w="15" w:type="dxa"/>
+        <w:tblCellMar>
+          <w:top w:w="15" w:type="dxa"/>
+          <w:left w:w="15" w:type="dxa"/>
+          <w:bottom w:w="15" w:type="dxa"/>
+          <w:right w:w="15" w:type="dxa"/>
+        </w:tblCellMar>
+        <w:tblLook w:val="04A0" w:firstRow="1" w:lastRow="0" w:firstColumn="1" w:lastColumn="0" w:noHBand="0" w:noVBand="1"/>
+      </w:tblPr>
+      <w:tblGrid>
+        <w:gridCol w:w="3904"/>
+        <w:gridCol w:w="1625"/>
+        <w:gridCol w:w="3309"/>
+      </w:tblGrid>
+      <w:tr>
+        <w:trPr>
+          <w:tblHeader/>
+          <w:tblCellSpacing w:w="15" w:type="dxa"/>
+        </w:trPr>
+        <w:tc>
+          <w:tcPr>
+            <w:tcW w:w="0" w:type="auto"/>
+            <w:vAlign w:val="center"/>
+            <w:hideMark/>
+          </w:tcPr>
+          <w:p>
+            <w:pPr>
+              <w:rPr>
+                <w:b/>
+                <w:bCs/>
+              </w:rPr>
+            </w:pPr>
+            <w:r>
+              <w:rPr>
+                <w:b/>
+                <w:bCs/>
+              </w:rPr>
+              <w:t>Elemento</w:t>
+            </w:r>
+          </w:p>
+        </w:tc>
+        <w:tc>
+          <w:tcPr>
+            <w:tcW w:w="1595" w:type="dxa"/>
+            <w:vAlign w:val="center"/>
+            <w:hideMark/>
+          </w:tcPr>
+          <w:p>
+            <w:pPr>
+              <w:rPr>
+                <w:b/>
+                <w:bCs/>
+              </w:rPr>
+            </w:pPr>
+            <w:r>
+              <w:rPr>
+                <w:b/>
+                <w:bCs/>
+              </w:rPr>
+              <w:t>Valor</w:t>
+            </w:r>
+          </w:p>
+        </w:tc>
+        <w:tc>
+          <w:tcPr>
+            <w:tcW w:w="3264" w:type="dxa"/>
+            <w:vAlign w:val="center"/>
+            <w:hideMark/>
+          </w:tcPr>
+          <w:p>
+            <w:pPr>
+              <w:rPr>
+                <w:b/>
+                <w:bCs/>
+              </w:rPr>
+            </w:pPr>
+            <w:r>
+              <w:rPr>
+                <w:b/>
+                <w:bCs/>
+              </w:rPr>
+              <w:t>Uso</w:t>
+            </w:r>
+          </w:p>
+        </w:tc>
+      </w:tr>
+      <w:tr>
+        <w:trPr>
+          <w:tblCellSpacing w:w="15" w:type="dxa"/>
+        </w:trPr>
+        <w:tc>
+          <w:tcPr>
+            <w:tcW w:w="0" w:type="auto"/>
+            <w:vAlign w:val="center"/>
+            <w:hideMark/>
+          </w:tcPr>
+          <w:p>
+            <w:proofErr w:type="spellStart"/>
+            <w:r>
+              <w:t>Padding</w:t>
+            </w:r>
+            <w:proofErr w:type="spellEnd"/>
+            <w:r>
+              <w:t xml:space="preserve"> interno del Header</w:t>
+            </w:r>
+          </w:p>
+        </w:tc>
+        <w:tc>
+          <w:tcPr>
+            <w:tcW w:w="1595" w:type="dxa"/>
+            <w:vAlign w:val="center"/>
+            <w:hideMark/>
+          </w:tcPr>
+          <w:p>
+            <w:r>
+              <w:t>18px 67px 18px 67px</w:t>
+            </w:r>
+          </w:p>
+        </w:tc>
+        <w:tc>
+          <w:tcPr>
+            <w:tcW w:w="3264" w:type="dxa"/>
+            <w:vAlign w:val="center"/>
+            <w:hideMark/>
+          </w:tcPr>
+          <w:p>
+            <w:r>
+              <w:t xml:space="preserve">Espacio entre el contenido del </w:t>
+            </w:r>
+            <w:proofErr w:type="spellStart"/>
+            <w:r>
+              <w:t>header</w:t>
+            </w:r>
+            <w:proofErr w:type="spellEnd"/>
+            <w:r>
+              <w:t xml:space="preserve"> y sus bordes.</w:t>
+            </w:r>
+          </w:p>
+        </w:tc>
+      </w:tr>
+      <w:tr>
+        <w:trPr>
+          <w:tblCellSpacing w:w="15" w:type="dxa"/>
+        </w:trPr>
+        <w:tc>
+          <w:tcPr>
+            <w:tcW w:w="0" w:type="auto"/>
+            <w:vAlign w:val="center"/>
+            <w:hideMark/>
+          </w:tcPr>
+          <w:p>
+            <w:r>
+              <w:t>Separación entre Logo y barra de búsqueda</w:t>
+            </w:r>
+          </w:p>
+        </w:tc>
+        <w:tc>
+          <w:tcPr>
+            <w:tcW w:w="1595" w:type="dxa"/>
+            <w:vAlign w:val="center"/>
+            <w:hideMark/>
+          </w:tcPr>
+          <w:p>
+            <w:r>
+              <w:t>92px</w:t>
+            </w:r>
+          </w:p>
+        </w:tc>
+        <w:tc>
+          <w:tcPr>
+            <w:tcW w:w="3264" w:type="dxa"/>
+            <w:vAlign w:val="center"/>
+            <w:hideMark/>
+          </w:tcPr>
+          <w:p>
+            <w:r>
+              <w:t>Distancia horizontal.</w:t>
+            </w:r>
+          </w:p>
+        </w:tc>
+      </w:tr>
+      <w:tr>
+        <w:trPr>
+          <w:tblCellSpacing w:w="15" w:type="dxa"/>
+        </w:trPr>
+        <w:tc>
+          <w:tcPr>
+            <w:tcW w:w="0" w:type="auto"/>
+            <w:vAlign w:val="center"/>
+            <w:hideMark/>
+          </w:tcPr>
+          <w:p>
+            <w:r>
+              <w:t>Separación entre barra de búsqueda y opciones de usuario</w:t>
+            </w:r>
+          </w:p>
+        </w:tc>
+        <w:tc>
+          <w:tcPr>
+            <w:tcW w:w="1595" w:type="dxa"/>
+            <w:vAlign w:val="center"/>
+            <w:hideMark/>
+          </w:tcPr>
+          <w:p>
+            <w:r>
+              <w:t>402px</w:t>
+            </w:r>
+          </w:p>
+        </w:tc>
+        <w:tc>
+          <w:tcPr>
+            <w:tcW w:w="3264" w:type="dxa"/>
+            <w:vAlign w:val="center"/>
+            <w:hideMark/>
+          </w:tcPr>
+          <w:p>
+            <w:r>
+              <w:t>Distancia horizontal.</w:t>
+            </w:r>
+          </w:p>
+        </w:tc>
+      </w:tr>
+      <w:tr>
+        <w:trPr>
+          <w:tblCellSpacing w:w="15" w:type="dxa"/>
+        </w:trPr>
+        <w:tc>
+          <w:tcPr>
+            <w:tcW w:w="0" w:type="auto"/>
+            <w:vAlign w:val="center"/>
+            <w:hideMark/>
+          </w:tcPr>
+          <w:p>
+            <w:proofErr w:type="spellStart"/>
+            <w:r>
+              <w:t>Padding</w:t>
+            </w:r>
+            <w:proofErr w:type="spellEnd"/>
+            <w:r>
+              <w:t xml:space="preserve"> interno del Footer</w:t>
+            </w:r>
+          </w:p>
+        </w:tc>
+        <w:tc>
+          <w:tcPr>
+            <w:tcW w:w="1595" w:type="dxa"/>
+            <w:vAlign w:val="center"/>
+            <w:hideMark/>
+          </w:tcPr>
+          <w:p>
+            <w:r>
+              <w:t>8px 67px 7px 67px</w:t>
+            </w:r>
+          </w:p>
+        </w:tc>
+        <w:tc>
+          <w:tcPr>
+            <w:tcW w:w="3264" w:type="dxa"/>
+            <w:vAlign w:val="center"/>
+            <w:hideMark/>
+          </w:tcPr>
+          <w:p>
+            <w:r>
+              <w:t xml:space="preserve">Espacio entre el contenido del </w:t>
+            </w:r>
+            <w:proofErr w:type="spellStart"/>
+            <w:r>
+              <w:t>footer</w:t>
+            </w:r>
+            <w:proofErr w:type="spellEnd"/>
+            <w:r>
+              <w:t xml:space="preserve"> y sus bordes.</w:t>
+            </w:r>
+          </w:p>
+        </w:tc>
+      </w:tr>
+    </w:tbl>
+    <w:p>
+      <w:r>
+        <w:pict w14:anchorId="2FEA2376">
+          <v:rect id="_x0000_i1027" style="width:0;height:1.5pt" o:hralign="center" o:hrstd="t" o:hr="t" fillcolor="#a0a0a0" stroked="f"/>
+        </w:pict>
+      </w:r>
+    </w:p>
+    <w:p>
+      <w:pPr>
+        <w:rPr>
+          <w:b/>
+          <w:bCs/>
+        </w:rPr>
+      </w:pPr>
+      <w:r>
+        <w:rPr>
+          <w:b/>
+          <w:bCs/>
+        </w:rPr>
+        <w:t>3. Formularios</w:t>
+      </w:r>
+    </w:p>
+    <w:tbl>
+      <w:tblPr>
+        <w:tblW w:w="0" w:type="auto"/>
+        <w:tblCellSpacing w:w="15" w:type="dxa"/>
+        <w:tblCellMar>
+          <w:top w:w="15" w:type="dxa"/>
+          <w:left w:w="15" w:type="dxa"/>
+          <w:bottom w:w="15" w:type="dxa"/>
+          <w:right w:w="15" w:type="dxa"/>
+        </w:tblCellMar>
+        <w:tblLook w:val="04A0" w:firstRow="1" w:lastRow="0" w:firstColumn="1" w:lastColumn="0" w:noHBand="0" w:noVBand="1"/>
+      </w:tblPr>
+      <w:tblGrid>
+        <w:gridCol w:w="2147"/>
+        <w:gridCol w:w="830"/>
+        <w:gridCol w:w="5861"/>
+      </w:tblGrid>
+      <w:tr>
+        <w:trPr>
+          <w:tblHeader/>
+          <w:tblCellSpacing w:w="15" w:type="dxa"/>
+        </w:trPr>
+        <w:tc>
+          <w:tcPr>
+            <w:tcW w:w="0" w:type="auto"/>
+            <w:vAlign w:val="center"/>
+            <w:hideMark/>
+          </w:tcPr>
+          <w:p>
+            <w:pPr>
+              <w:rPr>
+                <w:b/>
+                <w:bCs/>
+              </w:rPr>
+            </w:pPr>
+            <w:r>
+              <w:rPr>
+                <w:b/>
+                <w:bCs/>
+              </w:rPr>
+              <w:t>Elemento</w:t>
+            </w:r>
+          </w:p>
+        </w:tc>
+        <w:tc>
+          <w:tcPr>
+            <w:tcW w:w="800" w:type="dxa"/>
+            <w:vAlign w:val="center"/>
+            <w:hideMark/>
+          </w:tcPr>
+          <w:p>
+            <w:pPr>
+              <w:rPr>
+                <w:b/>
+                <w:bCs/>
+              </w:rPr>
+            </w:pPr>
+            <w:r>
+              <w:rPr>
+                <w:b/>
+                <w:bCs/>
+              </w:rPr>
+              <w:t>Valor</w:t>
+            </w:r>
+          </w:p>
+        </w:tc>
+        <w:tc>
+          <w:tcPr>
+            <w:tcW w:w="5816" w:type="dxa"/>
+            <w:vAlign w:val="center"/>
+            <w:hideMark/>
+          </w:tcPr>
+          <w:p>
+            <w:pPr>
+              <w:rPr>
+                <w:b/>
+                <w:bCs/>
+              </w:rPr>
+            </w:pPr>
+            <w:r>
+              <w:rPr>
+                <w:b/>
+                <w:bCs/>
+              </w:rPr>
+              <w:t>Uso</w:t>
+            </w:r>
+          </w:p>
+        </w:tc>
+      </w:tr>
+      <w:tr>
+        <w:trPr>
+          <w:tblCellSpacing w:w="15" w:type="dxa"/>
+        </w:trPr>
+        <w:tc>
+          <w:tcPr>
+            <w:tcW w:w="0" w:type="auto"/>
+            <w:vAlign w:val="center"/>
+            <w:hideMark/>
+          </w:tcPr>
+          <w:p>
+            <w:r>
+              <w:t>Título</w:t>
+            </w:r>
+            <w:r>
+              <w:t xml:space="preserve"> → </w:t>
+            </w:r>
+            <w:r>
+              <w:t>Subtítulo</w:t>
+            </w:r>
+          </w:p>
+        </w:tc>
+        <w:tc>
+          <w:tcPr>
+            <w:tcW w:w="800" w:type="dxa"/>
+            <w:vAlign w:val="center"/>
+            <w:hideMark/>
+          </w:tcPr>
+          <w:p>
+            <w:r>
+              <w:t>52px</w:t>
+            </w:r>
+          </w:p>
+        </w:tc>
+        <w:tc>
+          <w:tcPr>
+            <w:tcW w:w="5816" w:type="dxa"/>
+            <w:vAlign w:val="center"/>
+            <w:hideMark/>
+          </w:tcPr>
+          <w:p>
+            <w:r>
+              <w:t>Separación entre el título principal y el texto descriptivo.</w:t>
+            </w:r>
+          </w:p>
+        </w:tc>
+      </w:tr>
+      <w:tr>
+        <w:trPr>
+          <w:tblCellSpacing w:w="15" w:type="dxa"/>
+        </w:trPr>
+        <w:tc>
+          <w:tcPr>
+            <w:tcW w:w="0" w:type="auto"/>
+            <w:vAlign w:val="center"/>
+            <w:hideMark/>
+          </w:tcPr>
+          <w:p>
+            <w:r>
+              <w:t>Subtítulo</w:t>
+            </w:r>
+            <w:r>
+              <w:t xml:space="preserve"> </w:t>
+            </w:r>
+            <w:r>
+              <w:t xml:space="preserve">→ </w:t>
+            </w:r>
+            <w:r>
+              <w:t xml:space="preserve">Primer </w:t>
+            </w:r>
+            <w:r>
+              <w:t>Input</w:t>
+            </w:r>
+          </w:p>
+        </w:tc>
+        <w:tc>
+          <w:tcPr>
+            <w:tcW w:w="800" w:type="dxa"/>
+            <w:vAlign w:val="center"/>
+            <w:hideMark/>
+          </w:tcPr>
+          <w:p>
+            <w:r>
+              <w:t>69px</w:t>
+            </w:r>
+          </w:p>
+        </w:tc>
+        <w:tc>
+          <w:tcPr>
+            <w:tcW w:w="5816" w:type="dxa"/>
+            <w:vAlign w:val="center"/>
+            <w:hideMark/>
+          </w:tcPr>
+          <w:p>
+            <w:r>
+              <w:t>Separación</w:t>
+            </w:r>
+            <w:r>
+              <w:t xml:space="preserve"> entre la descripción y el primer campo del formulario.</w:t>
+            </w:r>
+          </w:p>
+        </w:tc>
+      </w:tr>
+      <w:tr>
+        <w:trPr>
+          <w:tblCellSpacing w:w="15" w:type="dxa"/>
+        </w:trPr>
+        <w:tc>
+          <w:tcPr>
+            <w:tcW w:w="0" w:type="auto"/>
+            <w:vAlign w:val="center"/>
+          </w:tcPr>
+          <w:p>
+            <w:r>
+              <w:t xml:space="preserve">Input </w:t>
+            </w:r>
+            <w:r>
+              <w:t>→</w:t>
+            </w:r>
+            <w:r>
+              <w:t xml:space="preserve"> Input</w:t>
+            </w:r>
+          </w:p>
+        </w:tc>
+        <w:tc>
+          <w:tcPr>
+            <w:tcW w:w="800" w:type="dxa"/>
+            <w:vAlign w:val="center"/>
+          </w:tcPr>
+          <w:p>
+            <w:r>
+              <w:t>26px</w:t>
+            </w:r>
+          </w:p>
+        </w:tc>
+        <w:tc>
+          <w:tcPr>
+            <w:tcW w:w="5816" w:type="dxa"/>
+            <w:vAlign w:val="center"/>
+          </w:tcPr>
+          <w:p>
+            <w:r>
+              <w:t>Separación vertical entre campos consecutivos.</w:t>
+            </w:r>
+          </w:p>
+        </w:tc>
+      </w:tr>
+      <w:tr>
+        <w:trPr>
+          <w:tblCellSpacing w:w="15" w:type="dxa"/>
+        </w:trPr>
+        <w:tc>
+          <w:tcPr>
+            <w:tcW w:w="0" w:type="auto"/>
+            <w:vAlign w:val="center"/>
+            <w:hideMark/>
+          </w:tcPr>
+          <w:p>
+            <w:r>
+              <w:t>Input → Botón</w:t>
+            </w:r>
+          </w:p>
+        </w:tc>
+        <w:tc>
+          <w:tcPr>
+            <w:tcW w:w="800" w:type="dxa"/>
+            <w:vAlign w:val="center"/>
+            <w:hideMark/>
+          </w:tcPr>
+          <w:p>
+            <w:r>
+              <w:t>64px</w:t>
+            </w:r>
+          </w:p>
+        </w:tc>
+        <w:tc>
+          <w:tcPr>
+            <w:tcW w:w="5816" w:type="dxa"/>
+            <w:vAlign w:val="center"/>
+            <w:hideMark/>
+          </w:tcPr>
+          <w:p>
+            <w:r>
+              <w:t>Separación entre el último campo del formulario y el botón principal.</w:t>
+            </w:r>
+          </w:p>
+        </w:tc>
+      </w:tr>
+      <w:tr>
+        <w:trPr>
+          <w:tblCellSpacing w:w="15" w:type="dxa"/>
+        </w:trPr>
+        <w:tc>
+          <w:tcPr>
+            <w:tcW w:w="0" w:type="auto"/>
+            <w:vAlign w:val="center"/>
+            <w:hideMark/>
+          </w:tcPr>
+          <w:p>
+            <w:r>
+              <w:t>Botón → Texto auxiliar</w:t>
+            </w:r>
+          </w:p>
+        </w:tc>
+        <w:tc>
+          <w:tcPr>
+            <w:tcW w:w="800" w:type="dxa"/>
+            <w:vAlign w:val="center"/>
+            <w:hideMark/>
+          </w:tcPr>
+          <w:p>
+            <w:r>
+              <w:t>39px</w:t>
+            </w:r>
+          </w:p>
+        </w:tc>
+        <w:tc>
+          <w:tcPr>
+            <w:tcW w:w="5816" w:type="dxa"/>
+            <w:vAlign w:val="center"/>
+            <w:hideMark/>
+          </w:tcPr>
+          <w:p>
+            <w:r>
+              <w:t>Separación</w:t>
+            </w:r>
+            <w:r>
+              <w:t xml:space="preserve"> entre el botón y enlaces o mensajes secundarios.</w:t>
+            </w:r>
+          </w:p>
+        </w:tc>
+      </w:tr>
+    </w:tbl>
+    <w:p>
+      <w:r>
+        <w:pict w14:anchorId="445F39B6">
+          <v:rect id="_x0000_i1028" style="width:0;height:1.5pt" o:hralign="center" o:hrstd="t" o:hr="t" fillcolor="#a0a0a0" stroked="f"/>
+        </w:pict>
+      </w:r>
+    </w:p>
+    <w:p>
+      <w:pPr>
+        <w:rPr>
+          <w:b/>
+          <w:bCs/>
+        </w:rPr>
+      </w:pPr>
+    </w:p>
+    <w:p>
+      <w:pPr>
+        <w:rPr>
+          <w:b/>
+          <w:bCs/>
+        </w:rPr>
+      </w:pPr>
+    </w:p>
+    <w:p>
+      <w:pPr>
+        <w:rPr>
+          <w:b/>
+          <w:bCs/>
+        </w:rPr>
+      </w:pPr>
+    </w:p>
+    <w:p>
+      <w:pPr>
+        <w:rPr>
+          <w:b/>
+          <w:bCs/>
+        </w:rPr>
+      </w:pPr>
+    </w:p>
+    <w:p>
+      <w:pPr>
+        <w:rPr>
+          <w:b/>
+          <w:bCs/>
+        </w:rPr>
+      </w:pPr>
+    </w:p>
+    <w:p>
+      <w:pPr>
+        <w:rPr>
+          <w:b/>
+          <w:bCs/>
+        </w:rPr>
+      </w:pPr>
+      <w:r>
+        <w:rPr>
+          <w:b/>
+          <w:bCs/>
+        </w:rPr>
+        <w:lastRenderedPageBreak/>
+        <w:t>4. Contenido</w:t>
+      </w:r>
+    </w:p>
+    <w:tbl>
+      <w:tblPr>
+        <w:tblW w:w="0" w:type="auto"/>
+        <w:tblCellSpacing w:w="15" w:type="dxa"/>
+        <w:tblCellMar>
+          <w:top w:w="15" w:type="dxa"/>
+          <w:left w:w="15" w:type="dxa"/>
+          <w:bottom w:w="15" w:type="dxa"/>
+          <w:right w:w="15" w:type="dxa"/>
+        </w:tblCellMar>
+        <w:tblLook w:val="04A0" w:firstRow="1" w:lastRow="0" w:firstColumn="1" w:lastColumn="0" w:noHBand="0" w:noVBand="1"/>
+      </w:tblPr>
+      <w:tblGrid>
+        <w:gridCol w:w="2604"/>
+        <w:gridCol w:w="1190"/>
+        <w:gridCol w:w="5044"/>
+      </w:tblGrid>
+      <w:tr>
+        <w:trPr>
+          <w:tblHeader/>
+          <w:tblCellSpacing w:w="15" w:type="dxa"/>
+        </w:trPr>
+        <w:tc>
+          <w:tcPr>
+            <w:tcW w:w="0" w:type="auto"/>
+            <w:vAlign w:val="center"/>
+            <w:hideMark/>
+          </w:tcPr>
+          <w:p>
+            <w:pPr>
+              <w:rPr>
+                <w:b/>
+                <w:bCs/>
+              </w:rPr>
+            </w:pPr>
+            <w:r>
+              <w:rPr>
+                <w:b/>
+                <w:bCs/>
+              </w:rPr>
+              <w:t>Elemento</w:t>
+            </w:r>
+          </w:p>
+        </w:tc>
+        <w:tc>
+          <w:tcPr>
+            <w:tcW w:w="1160" w:type="dxa"/>
+            <w:vAlign w:val="center"/>
+            <w:hideMark/>
+          </w:tcPr>
+          <w:p>
+            <w:pPr>
+              <w:rPr>
+                <w:b/>
+                <w:bCs/>
+              </w:rPr>
+            </w:pPr>
+            <w:r>
+              <w:rPr>
+                <w:b/>
+                <w:bCs/>
+              </w:rPr>
+              <w:t>Valor</w:t>
+            </w:r>
+          </w:p>
+        </w:tc>
+        <w:tc>
+          <w:tcPr>
+            <w:tcW w:w="4999" w:type="dxa"/>
+            <w:vAlign w:val="center"/>
+            <w:hideMark/>
+          </w:tcPr>
+          <w:p>
+            <w:pPr>
+              <w:rPr>
+                <w:b/>
+                <w:bCs/>
+              </w:rPr>
+            </w:pPr>
+            <w:r>
+              <w:rPr>
+                <w:b/>
+                <w:bCs/>
+              </w:rPr>
+              <w:t>Uso</w:t>
+            </w:r>
+          </w:p>
+        </w:tc>
+      </w:tr>
+      <w:tr>
+        <w:trPr>
+          <w:tblCellSpacing w:w="15" w:type="dxa"/>
+        </w:trPr>
+        <w:tc>
+          <w:tcPr>
+            <w:tcW w:w="0" w:type="auto"/>
+            <w:vAlign w:val="center"/>
+            <w:hideMark/>
+          </w:tcPr>
+          <w:p>
+            <w:r>
+              <w:t xml:space="preserve">Título → </w:t>
+            </w:r>
+            <w:r>
+              <w:t>Subtitulo</w:t>
+            </w:r>
+          </w:p>
+        </w:tc>
+        <w:tc>
+          <w:tcPr>
+            <w:tcW w:w="1160" w:type="dxa"/>
+            <w:vAlign w:val="center"/>
+            <w:hideMark/>
+          </w:tcPr>
+          <w:p>
+            <w:r>
+              <w:t>6</w:t>
+            </w:r>
+            <w:r>
+              <w:t>8</w:t>
+            </w:r>
+            <w:r>
+              <w:t>px</w:t>
+            </w:r>
+          </w:p>
+        </w:tc>
+        <w:tc>
+          <w:tcPr>
+            <w:tcW w:w="4999" w:type="dxa"/>
+            <w:vAlign w:val="center"/>
+            <w:hideMark/>
+          </w:tcPr>
+          <w:p>
+            <w:r>
+              <w:t>Distancia entre un título y su contenido.</w:t>
+            </w:r>
+          </w:p>
+        </w:tc>
+      </w:tr>
+      <w:tr>
+        <w:trPr>
+          <w:tblCellSpacing w:w="15" w:type="dxa"/>
+        </w:trPr>
+        <w:tc>
+          <w:tcPr>
+            <w:tcW w:w="0" w:type="auto"/>
+            <w:vAlign w:val="center"/>
+            <w:hideMark/>
+          </w:tcPr>
+          <w:p>
+            <w:r>
+              <w:t>Subtítulo → Contenido</w:t>
+            </w:r>
+          </w:p>
+        </w:tc>
+        <w:tc>
+          <w:tcPr>
+            <w:tcW w:w="1160" w:type="dxa"/>
+            <w:vAlign w:val="center"/>
+            <w:hideMark/>
+          </w:tcPr>
+          <w:p>
+            <w:r>
+              <w:t>30</w:t>
+            </w:r>
+            <w:r>
+              <w:t>px</w:t>
+            </w:r>
+          </w:p>
+        </w:tc>
+        <w:tc>
+          <w:tcPr>
+            <w:tcW w:w="4999" w:type="dxa"/>
+            <w:vAlign w:val="center"/>
+            <w:hideMark/>
+          </w:tcPr>
+          <w:p>
+            <w:r>
+              <w:t>Distancia entre un subtítulo y su contenido.</w:t>
+            </w:r>
+          </w:p>
+        </w:tc>
+      </w:tr>
+      <w:tr>
+        <w:trPr>
+          <w:tblCellSpacing w:w="15" w:type="dxa"/>
+        </w:trPr>
+        <w:tc>
+          <w:tcPr>
+            <w:tcW w:w="0" w:type="auto"/>
+            <w:vAlign w:val="center"/>
+          </w:tcPr>
+          <w:p>
+            <w:r>
+              <w:t xml:space="preserve">Contenido </w:t>
+            </w:r>
+            <w:r>
+              <w:t>→</w:t>
+            </w:r>
+            <w:r>
+              <w:t xml:space="preserve"> IPA</w:t>
+            </w:r>
+          </w:p>
+        </w:tc>
+        <w:tc>
+          <w:tcPr>
+            <w:tcW w:w="1160" w:type="dxa"/>
+            <w:vAlign w:val="center"/>
+          </w:tcPr>
+          <w:p>
+            <w:r>
+              <w:t>38px</w:t>
+            </w:r>
+          </w:p>
+        </w:tc>
+        <w:tc>
+          <w:tcPr>
+            <w:tcW w:w="4999" w:type="dxa"/>
+            <w:vAlign w:val="center"/>
+          </w:tcPr>
+          <w:p/>
+        </w:tc>
+      </w:tr>
+      <w:tr>
+        <w:trPr>
+          <w:tblCellSpacing w:w="15" w:type="dxa"/>
+        </w:trPr>
+        <w:tc>
+          <w:tcPr>
+            <w:tcW w:w="0" w:type="auto"/>
+            <w:vAlign w:val="center"/>
+            <w:hideMark/>
+          </w:tcPr>
+          <w:p>
+            <w:r>
+              <w:t xml:space="preserve">IPA </w:t>
+            </w:r>
+            <w:r>
+              <w:t xml:space="preserve">→ </w:t>
+            </w:r>
+            <w:proofErr w:type="spellStart"/>
+            <w:r>
+              <w:t>Boton</w:t>
+            </w:r>
+            <w:proofErr w:type="spellEnd"/>
+            <w:r>
+              <w:t xml:space="preserve"> audio</w:t>
+            </w:r>
+          </w:p>
+        </w:tc>
+        <w:tc>
+          <w:tcPr>
+            <w:tcW w:w="1160" w:type="dxa"/>
+            <w:vAlign w:val="center"/>
+            <w:hideMark/>
+          </w:tcPr>
+          <w:p>
+            <w:r>
+              <w:t>60px</w:t>
+            </w:r>
+          </w:p>
+        </w:tc>
+        <w:tc>
+          <w:tcPr>
+            <w:tcW w:w="4999" w:type="dxa"/>
+            <w:vAlign w:val="center"/>
+            <w:hideMark/>
+          </w:tcPr>
+          <w:p>
+            <w:r>
+              <w:t xml:space="preserve">Separación entre </w:t>
+            </w:r>
+            <w:r>
+              <w:t>IPA y botón hacia la derecha.</w:t>
+            </w:r>
+          </w:p>
+        </w:tc>
+      </w:tr>
+      <w:tr>
+        <w:trPr>
+          <w:tblCellSpacing w:w="15" w:type="dxa"/>
+        </w:trPr>
+        <w:tc>
+          <w:tcPr>
+            <w:tcW w:w="0" w:type="auto"/>
+            <w:vAlign w:val="center"/>
+          </w:tcPr>
+          <w:p>
+            <w:r>
+              <w:t xml:space="preserve">IPA </w:t>
+            </w:r>
+            <w:r>
+              <w:t>→</w:t>
+            </w:r>
+            <w:r>
+              <w:t xml:space="preserve"> </w:t>
+            </w:r>
+            <w:proofErr w:type="spellStart"/>
+            <w:r>
+              <w:t>Imagenes</w:t>
+            </w:r>
+            <w:proofErr w:type="spellEnd"/>
+          </w:p>
+        </w:tc>
+        <w:tc>
+          <w:tcPr>
+            <w:tcW w:w="1160" w:type="dxa"/>
+            <w:vAlign w:val="center"/>
+          </w:tcPr>
+          <w:p>
+            <w:r>
+              <w:t>39px</w:t>
+            </w:r>
+          </w:p>
+        </w:tc>
+        <w:tc>
+          <w:tcPr>
+            <w:tcW w:w="4999" w:type="dxa"/>
+            <w:vAlign w:val="center"/>
+          </w:tcPr>
+          <w:p/>
+        </w:tc>
+      </w:tr>
+      <w:tr>
+        <w:trPr>
+          <w:tblCellSpacing w:w="15" w:type="dxa"/>
+        </w:trPr>
+        <w:tc>
+          <w:tcPr>
+            <w:tcW w:w="0" w:type="auto"/>
+            <w:vAlign w:val="center"/>
+          </w:tcPr>
+          <w:p>
+            <w:r>
+              <w:t>Separación entre cada imagen</w:t>
+            </w:r>
+          </w:p>
+        </w:tc>
+        <w:tc>
+          <w:tcPr>
+            <w:tcW w:w="1160" w:type="dxa"/>
+            <w:vAlign w:val="center"/>
+          </w:tcPr>
+          <w:p>
+            <w:r>
+              <w:t>22px</w:t>
+            </w:r>
+          </w:p>
+        </w:tc>
+        <w:tc>
+          <w:tcPr>
+            <w:tcW w:w="4999" w:type="dxa"/>
+            <w:vAlign w:val="center"/>
+          </w:tcPr>
+          <w:p/>
+        </w:tc>
+      </w:tr>
+      <w:tr>
+        <w:trPr>
+          <w:tblCellSpacing w:w="15" w:type="dxa"/>
+        </w:trPr>
+        <w:tc>
+          <w:tcPr>
+            <w:tcW w:w="0" w:type="auto"/>
+            <w:vAlign w:val="center"/>
+          </w:tcPr>
+          <w:p>
+            <w:proofErr w:type="spellStart"/>
+            <w:r>
+              <w:t>Imagense</w:t>
+            </w:r>
+            <w:proofErr w:type="spellEnd"/>
+            <w:r>
+              <w:t xml:space="preserve"> </w:t>
+            </w:r>
+            <w:r>
+              <w:t>→</w:t>
+            </w:r>
+            <w:r>
+              <w:t xml:space="preserve"> Ejemplo(</w:t>
+            </w:r>
+            <w:proofErr w:type="spellStart"/>
+            <w:r>
+              <w:t>subtitlo</w:t>
+            </w:r>
+            <w:proofErr w:type="spellEnd"/>
+            <w:r>
+              <w:t>)</w:t>
+            </w:r>
+          </w:p>
+        </w:tc>
+        <w:tc>
+          <w:tcPr>
+            <w:tcW w:w="1160" w:type="dxa"/>
+            <w:vAlign w:val="center"/>
+          </w:tcPr>
+          <w:p>
+            <w:r>
+              <w:t>30px</w:t>
+            </w:r>
+          </w:p>
+        </w:tc>
+        <w:tc>
+          <w:tcPr>
+            <w:tcW w:w="4999" w:type="dxa"/>
+            <w:vAlign w:val="center"/>
+          </w:tcPr>
+          <w:p/>
+        </w:tc>
+      </w:tr>
+      <w:tr>
+        <w:trPr>
+          <w:tblCellSpacing w:w="15" w:type="dxa"/>
+        </w:trPr>
+        <w:tc>
+          <w:tcPr>
+            <w:tcW w:w="0" w:type="auto"/>
+            <w:vAlign w:val="center"/>
+            <w:hideMark/>
+          </w:tcPr>
+          <w:p>
+            <w:r>
+              <w:t>Panel lateral</w:t>
+            </w:r>
+            <w:r>
+              <w:t xml:space="preserve"> → </w:t>
+            </w:r>
+            <w:r>
+              <w:t>Contenido principal</w:t>
+            </w:r>
+          </w:p>
+        </w:tc>
+        <w:tc>
+          <w:tcPr>
+            <w:tcW w:w="1160" w:type="dxa"/>
+            <w:vAlign w:val="center"/>
+            <w:hideMark/>
+          </w:tcPr>
+          <w:p>
+            <w:r>
+              <w:t>128px</w:t>
+            </w:r>
+          </w:p>
+        </w:tc>
+        <w:tc>
+          <w:tcPr>
+            <w:tcW w:w="4999" w:type="dxa"/>
+            <w:vAlign w:val="center"/>
+            <w:hideMark/>
+          </w:tcPr>
+          <w:p>
+            <w:r>
+              <w:t>Separación entre panel lateral y contenido principal.</w:t>
+            </w:r>
+          </w:p>
+        </w:tc>
+      </w:tr>
+    </w:tbl>
+    <w:p>
+      <w:r>
+        <w:pict w14:anchorId="1435DEC6">
+          <v:rect id="_x0000_i1029" style="width:0;height:1.5pt" o:hralign="center" o:hrstd="t" o:hr="t" fillcolor="#a0a0a0" stroked="f"/>
+        </w:pict>
+      </w:r>
+    </w:p>
+    <w:p>
+      <w:pPr>
+        <w:rPr>
+          <w:b/>
+          <w:bCs/>
+        </w:rPr>
+      </w:pPr>
+      <w:r>
+        <w:rPr>
+          <w:b/>
+          <w:bCs/>
+        </w:rPr>
+        <w:t>5. Componentes</w:t>
+      </w:r>
+    </w:p>
+    <w:tbl>
+      <w:tblPr>
+        <w:tblW w:w="0" w:type="auto"/>
+        <w:tblCellSpacing w:w="15" w:type="dxa"/>
+        <w:tblCellMar>
+          <w:top w:w="15" w:type="dxa"/>
+          <w:left w:w="15" w:type="dxa"/>
+          <w:bottom w:w="15" w:type="dxa"/>
+          <w:right w:w="15" w:type="dxa"/>
+        </w:tblCellMar>
+        <w:tblLook w:val="04A0" w:firstRow="1" w:lastRow="0" w:firstColumn="1" w:lastColumn="0" w:noHBand="0" w:noVBand="1"/>
+      </w:tblPr>
+      <w:tblGrid>
+        <w:gridCol w:w="897"/>
+        <w:gridCol w:w="879"/>
+        <w:gridCol w:w="879"/>
+        <w:gridCol w:w="30"/>
+        <w:gridCol w:w="2034"/>
+        <w:gridCol w:w="4119"/>
+      </w:tblGrid>
+      <w:tr>
+        <w:trPr>
+          <w:tblHeader/>
+          <w:tblCellSpacing w:w="15" w:type="dxa"/>
+        </w:trPr>
+        <w:tc>
+          <w:tcPr>
+            <w:tcW w:w="0" w:type="auto"/>
+            <w:gridSpan w:val="4"/>
+            <w:vAlign w:val="center"/>
+            <w:hideMark/>
+          </w:tcPr>
+          <w:p>
+            <w:pPr>
+              <w:rPr>
+                <w:b/>
+                <w:bCs/>
+              </w:rPr>
+            </w:pPr>
+            <w:r>
+              <w:rPr>
+                <w:b/>
+                <w:bCs/>
+              </w:rPr>
+              <w:t>Elemento</w:t>
+            </w:r>
+          </w:p>
+        </w:tc>
+        <w:tc>
+          <w:tcPr>
+            <w:tcW w:w="0" w:type="auto"/>
+            <w:vAlign w:val="center"/>
+            <w:hideMark/>
+          </w:tcPr>
+          <w:p>
+            <w:pPr>
+              <w:rPr>
+                <w:b/>
+                <w:bCs/>
+              </w:rPr>
+            </w:pPr>
+            <w:r>
+              <w:rPr>
+                <w:b/>
+                <w:bCs/>
+              </w:rPr>
+              <w:t>Valor</w:t>
+            </w:r>
+          </w:p>
+        </w:tc>
+        <w:tc>
+          <w:tcPr>
+            <w:tcW w:w="0" w:type="auto"/>
+            <w:vAlign w:val="center"/>
+            <w:hideMark/>
+          </w:tcPr>
+          <w:p>
+            <w:pPr>
+              <w:rPr>
+                <w:b/>
+                <w:bCs/>
+              </w:rPr>
+            </w:pPr>
+            <w:r>
+              <w:rPr>
+                <w:b/>
+                <w:bCs/>
+              </w:rPr>
+              <w:t>Uso</w:t>
+            </w:r>
+          </w:p>
+        </w:tc>
+      </w:tr>
+      <w:tr>
+        <w:trPr>
+          <w:tblCellSpacing w:w="15" w:type="dxa"/>
+        </w:trPr>
+        <w:tc>
+          <w:tcPr>
+            <w:tcW w:w="0" w:type="auto"/>
+            <w:gridSpan w:val="4"/>
+            <w:vAlign w:val="center"/>
+            <w:hideMark/>
+          </w:tcPr>
+          <w:p>
+            <w:proofErr w:type="spellStart"/>
+            <w:r>
+              <w:t>Padding</w:t>
+            </w:r>
+            <w:proofErr w:type="spellEnd"/>
+            <w:r>
+              <w:t xml:space="preserve"> interno del botón</w:t>
+            </w:r>
+            <w:r>
+              <w:t xml:space="preserve"> audio</w:t>
+            </w:r>
+          </w:p>
+        </w:tc>
+        <w:tc>
+          <w:tcPr>
+            <w:tcW w:w="0" w:type="auto"/>
+            <w:vAlign w:val="center"/>
+            <w:hideMark/>
+          </w:tcPr>
+          <w:p>
+            <w:r>
+              <w:t>14px47px13px48px</w:t>
+            </w:r>
+          </w:p>
+        </w:tc>
+        <w:tc>
+          <w:tcPr>
+            <w:tcW w:w="0" w:type="auto"/>
+            <w:vAlign w:val="center"/>
+            <w:hideMark/>
+          </w:tcPr>
+          <w:p/>
+        </w:tc>
+      </w:tr>
+      <w:tr>
+        <w:trPr>
+          <w:tblCellSpacing w:w="15" w:type="dxa"/>
+        </w:trPr>
+        <w:tc>
+          <w:tcPr>
+            <w:tcW w:w="0" w:type="auto"/>
+            <w:gridSpan w:val="4"/>
+            <w:vAlign w:val="center"/>
+            <w:hideMark/>
+          </w:tcPr>
+          <w:p>
+            <w:proofErr w:type="spellStart"/>
+            <w:r>
+              <w:t>Padding</w:t>
+            </w:r>
+            <w:proofErr w:type="spellEnd"/>
+            <w:r>
+              <w:t xml:space="preserve"> interno del Input</w:t>
+            </w:r>
+            <w:r>
+              <w:t xml:space="preserve"> busca</w:t>
+            </w:r>
+            <w:r>
+              <w:t>r</w:t>
+            </w:r>
+          </w:p>
+        </w:tc>
+        <w:tc>
+          <w:tcPr>
+            <w:tcW w:w="0" w:type="auto"/>
+            <w:vAlign w:val="center"/>
+            <w:hideMark/>
+          </w:tcPr>
+          <w:p>
+            <w:r>
+              <w:t>17px70px17px70px</w:t>
+            </w:r>
+          </w:p>
+        </w:tc>
+        <w:tc>
+          <w:tcPr>
+            <w:tcW w:w="0" w:type="auto"/>
+            <w:vAlign w:val="center"/>
+            <w:hideMark/>
+          </w:tcPr>
+          <w:p>
+            <w:r>
+              <w:t>Espacio entre el texto y el borde del campo.</w:t>
+            </w:r>
+          </w:p>
+        </w:tc>
+      </w:tr>
+      <w:tr>
+        <w:trPr>
+          <w:tblCellSpacing w:w="15" w:type="dxa"/>
+        </w:trPr>
+        <w:tc>
+          <w:tcPr>
+            <w:tcW w:w="0" w:type="auto"/>
+            <w:gridSpan w:val="4"/>
+            <w:vAlign w:val="center"/>
+            <w:hideMark/>
+          </w:tcPr>
+          <w:p>
+            <w:r>
+              <w:t>Icono → Texto</w:t>
+            </w:r>
+          </w:p>
+        </w:tc>
+        <w:tc>
+          <w:tcPr>
+            <w:tcW w:w="0" w:type="auto"/>
+            <w:vAlign w:val="center"/>
+            <w:hideMark/>
+          </w:tcPr>
+          <w:p>
+            <w:r>
+              <w:t>23px</w:t>
+            </w:r>
+          </w:p>
+        </w:tc>
+        <w:tc>
+          <w:tcPr>
+            <w:tcW w:w="0" w:type="auto"/>
+            <w:vAlign w:val="center"/>
+            <w:hideMark/>
+          </w:tcPr>
+          <w:p>
+            <w:r>
+              <w:t>Distancia entre un icono y el texto que lo acompaña.</w:t>
+            </w:r>
+          </w:p>
+        </w:tc>
+      </w:tr>
+      <w:tr>
+        <w:trPr>
+          <w:gridAfter w:val="3"/>
+          <w:tblCellSpacing w:w="15" w:type="dxa"/>
+        </w:trPr>
+        <w:tc>
+          <w:tcPr>
+            <w:tcW w:w="0" w:type="auto"/>
+            <w:vAlign w:val="center"/>
+          </w:tcPr>
+          <w:p/>
+        </w:tc>
+        <w:tc>
+          <w:tcPr>
+            <w:tcW w:w="0" w:type="auto"/>
+            <w:vAlign w:val="center"/>
+          </w:tcPr>
+          <w:p/>
+        </w:tc>
+        <w:tc>
+          <w:tcPr>
+            <w:tcW w:w="0" w:type="auto"/>
+            <w:vAlign w:val="center"/>
+          </w:tcPr>
+          <w:p/>
+        </w:tc>
+      </w:tr>
+    </w:tbl>
+    <w:p/>
+    <w:p>
+      <w:r>
+        <w:br w:type="page"/>
+      </w:r>
+    </w:p>
+    <w:p>
+      <w:r>
+        <w:lastRenderedPageBreak/>
+        <w:pict w14:anchorId="71B01BBB">
+          <v:rect id="_x0000_i1030" style="width:0;height:1.5pt" o:hralign="center" o:hrstd="t" o:hr="t" fillcolor="#a0a0a0" stroked="f"/>
+        </w:pict>
+      </w:r>
+    </w:p>
+    <w:p>
+      <w:pPr>
+        <w:rPr>
+          <w:b/>
+          <w:bCs/>
+        </w:rPr>
+      </w:pPr>
+      <w:r>
+        <w:rPr>
+          <w:b/>
+          <w:bCs/>
+        </w:rPr>
+        <w:t>6. Listas</w:t>
+      </w:r>
+    </w:p>
+    <w:tbl>
+      <w:tblPr>
+        <w:tblW w:w="0" w:type="auto"/>
+        <w:tblCellSpacing w:w="15" w:type="dxa"/>
+        <w:tblCellMar>
+          <w:top w:w="15" w:type="dxa"/>
+          <w:left w:w="15" w:type="dxa"/>
+          <w:bottom w:w="15" w:type="dxa"/>
+          <w:right w:w="15" w:type="dxa"/>
+        </w:tblCellMar>
+        <w:tblLook w:val="04A0" w:firstRow="1" w:lastRow="0" w:firstColumn="1" w:lastColumn="0" w:noHBand="0" w:noVBand="1"/>
+      </w:tblPr>
+      <w:tblGrid>
+        <w:gridCol w:w="2307"/>
+        <w:gridCol w:w="625"/>
+        <w:gridCol w:w="5695"/>
+      </w:tblGrid>
+      <w:tr>
+        <w:trPr>
+          <w:tblHeader/>
+          <w:tblCellSpacing w:w="15" w:type="dxa"/>
+        </w:trPr>
+        <w:tc>
+          <w:tcPr>
+            <w:tcW w:w="0" w:type="auto"/>
+            <w:vAlign w:val="center"/>
+            <w:hideMark/>
+          </w:tcPr>
+          <w:p>
+            <w:pPr>
+              <w:rPr>
+                <w:b/>
+                <w:bCs/>
+              </w:rPr>
+            </w:pPr>
+            <w:r>
+              <w:rPr>
+                <w:b/>
+                <w:bCs/>
+              </w:rPr>
+              <w:t>Elemento</w:t>
+            </w:r>
+          </w:p>
+        </w:tc>
+        <w:tc>
+          <w:tcPr>
+            <w:tcW w:w="0" w:type="auto"/>
+            <w:vAlign w:val="center"/>
+            <w:hideMark/>
+          </w:tcPr>
+          <w:p>
+            <w:pPr>
+              <w:rPr>
+                <w:b/>
+                <w:bCs/>
+              </w:rPr>
+            </w:pPr>
+            <w:r>
+              <w:rPr>
+                <w:b/>
+                <w:bCs/>
+              </w:rPr>
+              <w:t>Valor</w:t>
+            </w:r>
+          </w:p>
+        </w:tc>
+        <w:tc>
+          <w:tcPr>
+            <w:tcW w:w="0" w:type="auto"/>
+            <w:vAlign w:val="center"/>
+            <w:hideMark/>
+          </w:tcPr>
+          <w:p>
+            <w:pPr>
+              <w:rPr>
+                <w:b/>
+                <w:bCs/>
+              </w:rPr>
+            </w:pPr>
+            <w:r>
+              <w:rPr>
+                <w:b/>
+                <w:bCs/>
+              </w:rPr>
+              <w:t>Uso</w:t>
+            </w:r>
+          </w:p>
+        </w:tc>
+      </w:tr>
+      <w:tr>
+        <w:trPr>
+          <w:tblCellSpacing w:w="15" w:type="dxa"/>
+        </w:trPr>
+        <w:tc>
+          <w:tcPr>
+            <w:tcW w:w="0" w:type="auto"/>
+            <w:vAlign w:val="center"/>
+            <w:hideMark/>
+          </w:tcPr>
+          <w:p>
+            <w:r>
+              <w:t>Título → Lista</w:t>
+            </w:r>
+          </w:p>
+        </w:tc>
+        <w:tc>
+          <w:tcPr>
+            <w:tcW w:w="0" w:type="auto"/>
+            <w:vAlign w:val="center"/>
+            <w:hideMark/>
+          </w:tcPr>
+          <w:p>
+            <w:r>
+              <w:t>77px</w:t>
+            </w:r>
+          </w:p>
+        </w:tc>
+        <w:tc>
+          <w:tcPr>
+            <w:tcW w:w="0" w:type="auto"/>
+            <w:vAlign w:val="center"/>
+            <w:hideMark/>
+          </w:tcPr>
+          <w:p>
+            <w:r>
+              <w:t>Separación entre el título de una lista y sus elementos.</w:t>
+            </w:r>
+          </w:p>
+        </w:tc>
+      </w:tr>
+      <w:tr>
+        <w:trPr>
+          <w:tblCellSpacing w:w="15" w:type="dxa"/>
+        </w:trPr>
+        <w:tc>
+          <w:tcPr>
+            <w:tcW w:w="0" w:type="auto"/>
+            <w:vAlign w:val="center"/>
+            <w:hideMark/>
+          </w:tcPr>
+          <w:p>
+            <w:r>
+              <w:t>Elemento → Elemento</w:t>
+            </w:r>
+          </w:p>
+        </w:tc>
+        <w:tc>
+          <w:tcPr>
+            <w:tcW w:w="0" w:type="auto"/>
+            <w:vAlign w:val="center"/>
+            <w:hideMark/>
+          </w:tcPr>
+          <w:p>
+            <w:r>
+              <w:t>20px</w:t>
+            </w:r>
+          </w:p>
+        </w:tc>
+        <w:tc>
+          <w:tcPr>
+            <w:tcW w:w="0" w:type="auto"/>
+            <w:vAlign w:val="center"/>
+            <w:hideMark/>
+          </w:tcPr>
+          <w:p>
+            <w:r>
+              <w:t>Distancia entre elementos consecutivos de una lista.</w:t>
+            </w:r>
+          </w:p>
+        </w:tc>
+      </w:tr>
+      <w:tr>
+        <w:trPr>
+          <w:tblCellSpacing w:w="15" w:type="dxa"/>
+        </w:trPr>
+        <w:tc>
+          <w:tcPr>
+            <w:tcW w:w="0" w:type="auto"/>
+            <w:vAlign w:val="center"/>
+            <w:hideMark/>
+          </w:tcPr>
+          <w:p>
+            <w:r>
+              <w:t>Lista → Contenido</w:t>
+            </w:r>
+          </w:p>
+        </w:tc>
+        <w:tc>
+          <w:tcPr>
+            <w:tcW w:w="0" w:type="auto"/>
+            <w:vAlign w:val="center"/>
+            <w:hideMark/>
+          </w:tcPr>
+          <w:p/>
+        </w:tc>
+        <w:tc>
+          <w:tcPr>
+            <w:tcW w:w="0" w:type="auto"/>
+            <w:vAlign w:val="center"/>
+            <w:hideMark/>
+          </w:tcPr>
+          <w:p>
+            <w:r>
+              <w:t>Separación entre una lista y el contenido relacionado.</w:t>
+            </w:r>
+          </w:p>
+        </w:tc>
+      </w:tr>
+    </w:tbl>
+    <w:p>
+      <w:r>
+        <w:pict w14:anchorId="0C24D1EB">
+          <v:rect id="_x0000_i1031" style="width:0;height:1.5pt" o:hralign="center" o:hrstd="t" o:hr="t" fillcolor="#a0a0a0" stroked="f"/>
+        </w:pict>
+      </w:r>
+    </w:p>
+    <w:p>
+      <w:pPr>
+        <w:rPr>
+          <w:b/>
+          <w:bCs/>
+        </w:rPr>
+      </w:pPr>
+      <w:r>
+        <w:rPr>
+          <w:b/>
+          <w:bCs/>
+        </w:rPr>
+        <w:t>Resultado</w:t>
+      </w:r>
+    </w:p>
+    <w:p>
+      <w:r>
+        <w:t xml:space="preserve">Con esta estructura tendrás </w:t>
+      </w:r>
+      <w:r>
+        <w:rPr>
+          <w:b/>
+          <w:bCs/>
+        </w:rPr>
+        <w:t>20 reglas de espaciado</w:t>
+      </w:r>
+      <w:r>
+        <w:t>, suficientes para mantener una interfaz consistente sin sobrecargar el documento.</w:t>
+      </w:r>
+    </w:p>
+    <w:p>
+      <w:pPr>
+        <w:rPr>
+          <w:b/>
+          <w:bCs/>
+        </w:rPr>
+      </w:pPr>
+      <w:r>
+        <w:rPr>
+          <w:b/>
+          <w:bCs/>
+        </w:rPr>
+        <w:t>¿Por qué me gusta esta organización?</w:t>
+      </w:r>
+    </w:p>
+    <w:p>
+      <w:r>
+        <w:t>Porque si mañana diseñas otra pantalla, por ejemplo:</w:t>
+      </w:r>
+    </w:p>
+    <w:p>
+      <w:pPr>
+        <w:numPr>
+          <w:ilvl w:val="0"/>
+          <w:numId w:val="1"/>
+        </w:numPr>
+      </w:pPr>
+      <w:r>
+        <w:t>Mis listas</w:t>
+      </w:r>
+    </w:p>
+    <w:p>
+      <w:pPr>
+        <w:numPr>
+          <w:ilvl w:val="0"/>
+          <w:numId w:val="1"/>
+        </w:numPr>
+      </w:pPr>
+      <w:r>
+        <w:t>Perfil</w:t>
+      </w:r>
+    </w:p>
+    <w:p>
+      <w:pPr>
+        <w:numPr>
+          <w:ilvl w:val="0"/>
+          <w:numId w:val="1"/>
+        </w:numPr>
+      </w:pPr>
+      <w:r>
+        <w:t>Estadísticas</w:t>
+      </w:r>
+    </w:p>
+    <w:p>
+      <w:pPr>
+        <w:numPr>
+          <w:ilvl w:val="0"/>
+          <w:numId w:val="1"/>
+        </w:numPr>
+      </w:pPr>
+      <w:r>
+        <w:t>Configuración</w:t>
+      </w:r>
+    </w:p>
+    <w:p>
+      <w:pPr>
+        <w:numPr>
+          <w:ilvl w:val="0"/>
+          <w:numId w:val="1"/>
+        </w:numPr>
+      </w:pPr>
+      <w:r>
+        <w:t>Iniciar sesión</w:t>
+      </w:r>
+    </w:p>
+    <w:p>
+      <w:r>
+        <w:rPr>
+          <w:b/>
+          <w:bCs/>
+        </w:rPr>
+        <w:t>No tendrás que crear nuevas reglas de espaciado.</w:t>
+      </w:r>
+      <w:r>
+        <w:t xml:space="preserve"> Simplemente reutilizarás las mismas 20 reglas en toda la aplicación.</w:t>
+      </w:r>
+    </w:p>
+    <w:p>
+      <w:r>
+        <w:t>Es una forma de trabajar muy común en equipos de diseño: primero se define un conjunto pequeño de reglas reutilizables y luego todas las pantallas las siguen. Eso hace que el diseño sea más consistente y también facilita el desarrollo cuando empieces a convertir esos diseños en componentes con CSS.</w:t>
       </w:r>
     </w:p>
     <w:p/>
@@ -662,6 +2902,163 @@
     </w:sectPr>
   </w:body>
 </w:document>
+</file>
+
+<file path=word/numbering.xml><?xml version="1.0" encoding="utf-8"?>
+<w:numbering xmlns:wpc="http://schemas.microsoft.com/office/word/2010/wordprocessingCanvas" xmlns:cx="http://schemas.microsoft.com/office/drawing/2014/chartex" xmlns:cx1="http://schemas.microsoft.com/office/drawing/2015/9/8/chartex" xmlns:cx2="http://schemas.microsoft.com/office/drawing/2015/10/21/chartex" xmlns:cx3="http://schemas.microsoft.com/office/drawing/2016/5/9/chartex" xmlns:cx4="http://schemas.microsoft.com/office/drawing/2016/5/10/chartex" xmlns:cx5="http://schemas.microsoft.com/office/drawing/2016/5/11/chartex" xmlns:cx6="http://schemas.microsoft.com/office/drawing/2016/5/12/chartex" xmlns:cx7="http://schemas.microsoft.com/office/drawing/2016/5/13/chartex" xmlns:cx8="http://schemas.microsoft.com/office/drawing/2016/5/14/chartex" xmlns:mc="http://schemas.openxmlformats.org/markup-compatibility/2006" xmlns:aink="http://schemas.microsoft.com/office/drawing/2016/ink" xmlns:am3d="http://schemas.microsoft.com/office/drawing/2017/model3d" xmlns:o="urn:schemas-microsoft-com:office:office" xmlns:oel="http://schemas.microsoft.com/office/2019/extlst" xmlns:r="http://schemas.openxmlformats.org/officeDocument/2006/relationships" xmlns:m="http://schemas.openxmlformats.org/officeDocument/2006/math" xmlns:v="urn:schemas-microsoft-com:vml" xmlns:wp14="http://schemas.microsoft.com/office/word/2010/wordprocessingDrawing" xmlns:wp="http://schemas.openxmlformats.org/drawingml/2006/wordprocessingDrawing" xmlns:w10="urn:schemas-microsoft-com:office:word" xmlns:w="http://schemas.openxmlformats.org/wordprocessingml/2006/main" xmlns:w14="http://schemas.microsoft.com/office/word/2010/wordml" xmlns:w15="http://schemas.microsoft.com/office/word/2012/wordml" xmlns:w16cex="http://schemas.microsoft.com/office/word/2018/wordml/cex" xmlns:w16cid="http://schemas.microsoft.com/office/word/2016/wordml/cid" xmlns:w16="http://schemas.microsoft.com/office/word/2018/wordml" xmlns:w16du="http://schemas.microsoft.com/office/word/2023/wordml/word16du" xmlns:w16sdtdh="http://schemas.microsoft.com/office/word/2020/wordml/sdtdatahash" xmlns:w16sdtfl="http://schemas.microsoft.com/office/word/2024/wordml/sdtformatlock" xmlns:w16se="http://schemas.microsoft.com/office/word/2015/wordml/symex" xmlns:wpg="http://schemas.microsoft.com/office/word/2010/wordprocessingGroup" xmlns:wpi="http://schemas.microsoft.com/office/word/2010/wordprocessingInk" xmlns:wne="http://schemas.microsoft.com/office/word/2006/wordml" xmlns:wps="http://schemas.microsoft.com/office/word/2010/wordprocessingShape" mc:Ignorable="w14 w15 w16se w16cid w16 w16cex w16sdtdh w16sdtfl w16du wp14">
+  <w:abstractNum w:abstractNumId="0" w15:restartNumberingAfterBreak="0">
+    <w:nsid w:val="196F748C"/>
+    <w:multiLevelType w:val="multilevel"/>
+    <w:tmpl w:val="DF5A2406"/>
+    <w:lvl w:ilvl="0">
+      <w:start w:val="1"/>
+      <w:numFmt w:val="bullet"/>
+      <w:lvlText w:val=""/>
+      <w:lvlJc w:val="left"/>
+      <w:pPr>
+        <w:tabs>
+          <w:tab w:val="num" w:pos="720"/>
+        </w:tabs>
+        <w:ind w:left="720" w:hanging="360"/>
+      </w:pPr>
+      <w:rPr>
+        <w:rFonts w:ascii="Symbol" w:hAnsi="Symbol" w:hint="default"/>
+        <w:sz w:val="20"/>
+      </w:rPr>
+    </w:lvl>
+    <w:lvl w:ilvl="1" w:tentative="1">
+      <w:start w:val="1"/>
+      <w:numFmt w:val="bullet"/>
+      <w:lvlText w:val="o"/>
+      <w:lvlJc w:val="left"/>
+      <w:pPr>
+        <w:tabs>
+          <w:tab w:val="num" w:pos="1440"/>
+        </w:tabs>
+        <w:ind w:left="1440" w:hanging="360"/>
+      </w:pPr>
+      <w:rPr>
+        <w:rFonts w:ascii="Courier New" w:hAnsi="Courier New" w:hint="default"/>
+        <w:sz w:val="20"/>
+      </w:rPr>
+    </w:lvl>
+    <w:lvl w:ilvl="2" w:tentative="1">
+      <w:start w:val="1"/>
+      <w:numFmt w:val="bullet"/>
+      <w:lvlText w:val=""/>
+      <w:lvlJc w:val="left"/>
+      <w:pPr>
+        <w:tabs>
+          <w:tab w:val="num" w:pos="2160"/>
+        </w:tabs>
+        <w:ind w:left="2160" w:hanging="360"/>
+      </w:pPr>
+      <w:rPr>
+        <w:rFonts w:ascii="Wingdings" w:hAnsi="Wingdings" w:hint="default"/>
+        <w:sz w:val="20"/>
+      </w:rPr>
+    </w:lvl>
+    <w:lvl w:ilvl="3" w:tentative="1">
+      <w:start w:val="1"/>
+      <w:numFmt w:val="bullet"/>
+      <w:lvlText w:val=""/>
+      <w:lvlJc w:val="left"/>
+      <w:pPr>
+        <w:tabs>
+          <w:tab w:val="num" w:pos="2880"/>
+        </w:tabs>
+        <w:ind w:left="2880" w:hanging="360"/>
+      </w:pPr>
+      <w:rPr>
+        <w:rFonts w:ascii="Wingdings" w:hAnsi="Wingdings" w:hint="default"/>
+        <w:sz w:val="20"/>
+      </w:rPr>
+    </w:lvl>
+    <w:lvl w:ilvl="4" w:tentative="1">
+      <w:start w:val="1"/>
+      <w:numFmt w:val="bullet"/>
+      <w:lvlText w:val=""/>
+      <w:lvlJc w:val="left"/>
+      <w:pPr>
+        <w:tabs>
+          <w:tab w:val="num" w:pos="3600"/>
+        </w:tabs>
+        <w:ind w:left="3600" w:hanging="360"/>
+      </w:pPr>
+      <w:rPr>
+        <w:rFonts w:ascii="Wingdings" w:hAnsi="Wingdings" w:hint="default"/>
+        <w:sz w:val="20"/>
+      </w:rPr>
+    </w:lvl>
+    <w:lvl w:ilvl="5" w:tentative="1">
+      <w:start w:val="1"/>
+      <w:numFmt w:val="bullet"/>
+      <w:lvlText w:val=""/>
+      <w:lvlJc w:val="left"/>
+      <w:pPr>
+        <w:tabs>
+          <w:tab w:val="num" w:pos="4320"/>
+        </w:tabs>
+        <w:ind w:left="4320" w:hanging="360"/>
+      </w:pPr>
+      <w:rPr>
+        <w:rFonts w:ascii="Wingdings" w:hAnsi="Wingdings" w:hint="default"/>
+        <w:sz w:val="20"/>
+      </w:rPr>
+    </w:lvl>
+    <w:lvl w:ilvl="6" w:tentative="1">
+      <w:start w:val="1"/>
+      <w:numFmt w:val="bullet"/>
+      <w:lvlText w:val=""/>
+      <w:lvlJc w:val="left"/>
+      <w:pPr>
+        <w:tabs>
+          <w:tab w:val="num" w:pos="5040"/>
+        </w:tabs>
+        <w:ind w:left="5040" w:hanging="360"/>
+      </w:pPr>
+      <w:rPr>
+        <w:rFonts w:ascii="Wingdings" w:hAnsi="Wingdings" w:hint="default"/>
+        <w:sz w:val="20"/>
+      </w:rPr>
+    </w:lvl>
+    <w:lvl w:ilvl="7" w:tentative="1">
+      <w:start w:val="1"/>
+      <w:numFmt w:val="bullet"/>
+      <w:lvlText w:val=""/>
+      <w:lvlJc w:val="left"/>
+      <w:pPr>
+        <w:tabs>
+          <w:tab w:val="num" w:pos="5760"/>
+        </w:tabs>
+        <w:ind w:left="5760" w:hanging="360"/>
+      </w:pPr>
+      <w:rPr>
+        <w:rFonts w:ascii="Wingdings" w:hAnsi="Wingdings" w:hint="default"/>
+        <w:sz w:val="20"/>
+      </w:rPr>
+    </w:lvl>
+    <w:lvl w:ilvl="8" w:tentative="1">
+      <w:start w:val="1"/>
+      <w:numFmt w:val="bullet"/>
+      <w:lvlText w:val=""/>
+      <w:lvlJc w:val="left"/>
+      <w:pPr>
+        <w:tabs>
+          <w:tab w:val="num" w:pos="6480"/>
+        </w:tabs>
+        <w:ind w:left="6480" w:hanging="360"/>
+      </w:pPr>
+      <w:rPr>
+        <w:rFonts w:ascii="Wingdings" w:hAnsi="Wingdings" w:hint="default"/>
+        <w:sz w:val="20"/>
+      </w:rPr>
+    </w:lvl>
+  </w:abstractNum>
+  <w:num w:numId="1" w16cid:durableId="668022833">
+    <w:abstractNumId w:val="0"/>
+  </w:num>
+</w:numbering>
 </file>
 
 <file path=word/styles.xml><?xml version="1.0" encoding="utf-8"?>

</xml_diff>